<commit_message>
Update Word Report with complete line-by-line code logic breakdowns and Viva Voce master guide
</commit_message>
<xml_diff>
--- a/Linear_Algebra_Project_Report.docx
+++ b/Linear_Algebra_Project_Report.docx
@@ -17,8 +17,8 @@
             <w:tcW w:type="dxa" w:w="9360"/>
             <w:shd w:fill="0F172A"/>
             <w:tcMar>
-              <w:top w:w="300" w:type="dxa"/>
-              <w:bottom w:w="300" w:type="dxa"/>
+              <w:top w:w="320" w:type="dxa"/>
+              <w:bottom w:w="320" w:type="dxa"/>
               <w:left w:w="300" w:type="dxa"/>
               <w:right w:w="300" w:type="dxa"/>
             </w:tcMar>
@@ -44,7 +44,7 @@
                 <w:color w:val="94A3B8"/>
                 <w:sz w:val="26"/>
               </w:rPr>
-              <w:t>Interactive Mathematical Solvers, Data Science Applications &amp; Project Report</w:t>
+              <w:t>Comprehensive Project Documentation, Deep-Dive Code Logic &amp; Viva Voce Exam Defense Guide</w:t>
               <w:br/>
               <w:br/>
             </w:r>
@@ -53,11 +53,11 @@
                 <w:rFonts w:ascii="Calibri" w:hAnsi="Calibri"/>
                 <w:b/>
                 <w:color w:val="34D399"/>
-                <w:sz w:val="22"/>
+                <w:sz w:val="21"/>
               </w:rPr>
-              <w:t>Developed by: Parth &amp; Hariom | Built with Python 3.14 &amp; Django 6.0</w:t>
+              <w:t>Project Team: Parth (Lead Backend Developer) &amp; Hariom (Co-Developer / UI-UX)</w:t>
               <w:br/>
-              <w:t>Live Site: https://linear-algebra-website.vercel.app/</w:t>
+              <w:t>Framework: Python 3.14, Django 6.0, SymPy 1.14, Supabase Auth | Live: https://linear-algebra-website.vercel.app/</w:t>
             </w:r>
           </w:p>
         </w:tc>
@@ -71,7 +71,7 @@
     <w:p>
       <w:pPr>
         <w:pStyle w:val="Heading1"/>
-        <w:spacing w:before="280" w:after="120"/>
+        <w:spacing w:before="320" w:after="120"/>
       </w:pPr>
       <w:r>
         <w:rPr>
@@ -80,20 +80,17 @@
           <w:color w:val="7C3AED"/>
           <w:sz w:val="36"/>
         </w:rPr>
-        <w:t>1. Executive Summary &amp; Project Overview</w:t>
+        <w:t>1. Executive Summary &amp; System Architecture</w:t>
+      </w:r>
+    </w:p>
+    <w:p>
+      <w:r>
+        <w:t>The Linear Algebra &amp; Data Science Explorer is an interactive, web-based computational platform designed to bridge theoretical linear algebra with practical Data Science and Artificial Intelligence applications. Linear algebra is the mathematical engine behind modern computer vision, natural language processing, neural network backpropagation, dimensionality reduction, and optimization algorithms. This project implements 6 core linear algebra solvers with step-by-step mathematical derivations, LaTeX formatting, interactive 3D visualizations, and downloadable PDF reports.</w:t>
       </w:r>
     </w:p>
     <w:p>
       <w:pPr>
-        <w:spacing w:after="160"/>
-      </w:pPr>
-      <w:r>
-        <w:t>The Linear Algebra &amp; Data Science Explorer is an interactive web application designed to bridge abstract mathematical theory with practical data science computational applications. Linear algebra forms the foundational backbone of modern artificial intelligence, machine learning, computer graphics, optimization, and scientific computing. This project implements 6 essential linear algebra algorithms with step-by-step mathematical derivations, LaTeX typesetting, interactive 3D graphics visualizations, and automated PDF solution reporting.</w:t>
-      </w:r>
-    </w:p>
-    <w:p>
-      <w:pPr>
-        <w:spacing w:after="280"/>
+        <w:spacing w:after="240"/>
       </w:pPr>
       <w:r>
         <w:rPr>
@@ -109,27 +106,27 @@
         <w:rPr>
           <w:b/>
         </w:rPr>
-        <w:t xml:space="preserve">• Project Team: </w:t>
+        <w:t xml:space="preserve">• Project Developers: </w:t>
       </w:r>
       <w:r>
-        <w:t>Parth (Lead Developer &amp; Backend Architect) &amp; Hariom (Co-Developer &amp; UI/UX Engineer)</w:t>
+        <w:t>Parth (Lead Backend Developer &amp; System Architect) &amp; Hariom (Co-Developer &amp; UI/UX Engineer)</w:t>
         <w:br/>
       </w:r>
       <w:r>
         <w:rPr>
           <w:b/>
         </w:rPr>
-        <w:t xml:space="preserve">• Framework: </w:t>
+        <w:t xml:space="preserve">• Technology Stack: </w:t>
       </w:r>
       <w:r>
-        <w:t>Python 3.12 / 3.14, Django 6.0, SymPy, NumPy, Supabase Auth</w:t>
+        <w:t>Python 3.14, Django 6.0, SymPy 1.14, NumPy 2.2, Supabase Auth (PostgreSQL), Bootstrap 5.3, MathJax v3, HTML5 Canvas 3D Engine, Vercel Serverless Functions</w:t>
         <w:br/>
       </w:r>
       <w:r>
         <w:rPr>
           <w:b/>
         </w:rPr>
-        <w:t xml:space="preserve">• Live Production URL: </w:t>
+        <w:t xml:space="preserve">• Live Application URL: </w:t>
       </w:r>
       <w:r>
         <w:t>https://linear-algebra-website.vercel.app/</w:t>
@@ -146,9 +143,24 @@
       </w:r>
     </w:p>
     <w:p>
+      <w:r>
+        <w:t>Data Flow Architecture:</w:t>
+        <w:br/>
+        <w:t>1. User enters matrix or vector parameters on web UI template.</w:t>
+        <w:br/>
+        <w:t>2. Django views (linear_algebra/views.py) receive HTTP POST request and pass data to math_engine.py.</w:t>
+        <w:br/>
+        <w:t>3. SymPy and NumPy compute exact symbolic fractions, RREF, determinants, and eigenspaces.</w:t>
+        <w:br/>
+        <w:t>4. Output dictionaries containing LaTeX strings ($det(A) = 0$) are passed back to HTML templates.</w:t>
+        <w:br/>
+        <w:t>5. MathJax renders LaTeX formulas client-side, and HTML5 Canvas renders interactive 3D vector orbiting.</w:t>
+      </w:r>
+    </w:p>
+    <w:p>
       <w:pPr>
         <w:pStyle w:val="Heading1"/>
-        <w:spacing w:before="280" w:after="120"/>
+        <w:spacing w:before="320" w:after="120"/>
       </w:pPr>
       <w:r>
         <w:rPr>
@@ -157,15 +169,7 @@
           <w:color w:val="7C3AED"/>
           <w:sz w:val="36"/>
         </w:rPr>
-        <w:t>2. Complete Technology Stack &amp; Architecture</w:t>
-      </w:r>
-    </w:p>
-    <w:p>
-      <w:pPr>
-        <w:spacing w:after="160"/>
-      </w:pPr>
-      <w:r>
-        <w:t>The system follows the Django Model-Template-View (MTV) design pattern, coupled with modern web standards and serverless deployment protocols. Below is a detailed breakdown of all languages, libraries, platforms, and services utilized:</w:t>
+        <w:t>2. Technology Stack &amp; Service Roles</w:t>
       </w:r>
     </w:p>
     <w:tbl>
@@ -194,7 +198,7 @@
                 <w:b/>
                 <w:color w:val="FFFFFF"/>
               </w:rPr>
-              <w:t>Component / Layer</w:t>
+              <w:t>Component Layer</w:t>
             </w:r>
           </w:p>
         </w:tc>
@@ -267,7 +271,7 @@
           </w:tcPr>
           <w:p>
             <w:r>
-              <w:t>Python 3.12 / 3.14</w:t>
+              <w:t>Python 3.14</w:t>
             </w:r>
           </w:p>
         </w:tc>
@@ -774,7 +778,7 @@
     <w:p>
       <w:pPr>
         <w:pStyle w:val="Heading1"/>
-        <w:spacing w:before="280" w:after="120"/>
+        <w:spacing w:before="320" w:after="120"/>
       </w:pPr>
       <w:r>
         <w:rPr>
@@ -783,18 +787,13 @@
           <w:color w:val="7C3AED"/>
           <w:sz w:val="36"/>
         </w:rPr>
-        <w:t>3. Deep Dive: The 6 Linear Algebra Concepts &amp; Python Logic</w:t>
-      </w:r>
-    </w:p>
-    <w:p>
-      <w:r>
-        <w:t>This section explains the exact mathematical theory, real-world data science application, and Python code implementation for each of the 6 interactive solvers included in the project:</w:t>
+        <w:t>3. Helper Utility Functions Code Logic</w:t>
       </w:r>
     </w:p>
     <w:p>
       <w:pPr>
         <w:pStyle w:val="Heading2"/>
-        <w:spacing w:before="280" w:after="120"/>
+        <w:spacing w:before="320" w:after="120"/>
       </w:pPr>
       <w:r>
         <w:rPr>
@@ -803,107 +802,79 @@
           <w:color w:val="0F172A"/>
           <w:sz w:val="28"/>
         </w:rPr>
-        <w:t>3.1 Gaussian Elimination &amp; System of Linear Equations</w:t>
+        <w:t>3.1 Decimal Cleaning: clean_val_2dp(val)</w:t>
       </w:r>
     </w:p>
     <w:p>
       <w:r>
-        <w:rPr>
-          <w:b/>
-        </w:rPr>
-        <w:t xml:space="preserve">• Mathematical Concept: </w:t>
-      </w:r>
-      <w:r>
-        <w:t>Gaussian Elimination transforms an augmented matrix [A | b] into Row Echelon Form (REF) and Reduced Row Echelon Form (RREF) using elementary row operations (row swapping, scaling, and elimination).</w:t>
+        <w:t>Python floats often generate messy decimals like 1.00000000000000 or 3.1415926535. clean_val_2dp converts float 1.0 -&gt; integer 1, and rounds decimals to at most 2 decimal places (3.14). It also recursively inspects SymPy expressions to clean embedded floating-point atoms.</w:t>
       </w:r>
     </w:p>
-    <w:p>
-      <w:r>
-        <w:rPr>
-          <w:b/>
-        </w:rPr>
-        <w:t xml:space="preserve">• Data Science Application: </w:t>
-      </w:r>
-      <w:r>
-        <w:t>Solving linear regression normal equations (X^T X beta = X^T y), structural network flow analysis, electrical circuit currents, and economic input-output models.</w:t>
-      </w:r>
-    </w:p>
-    <w:p>
-      <w:r>
-        <w:rPr>
-          <w:b/>
-        </w:rPr>
-        <w:t xml:space="preserve">• Python Function: </w:t>
-      </w:r>
-      <w:r>
-        <w:rPr>
-          <w:rFonts w:ascii="Consolas" w:hAnsi="Consolas"/>
-        </w:rPr>
-        <w:t>solve_gaussian_elimination(matrix_data)</w:t>
-      </w:r>
-    </w:p>
-    <w:p>
-      <w:r>
-        <w:rPr>
-          <w:b/>
-        </w:rPr>
-        <w:t>Python Implementation &amp; Logic Walkthrough:</w:t>
-      </w:r>
-    </w:p>
-    <w:p>
-      <w:pPr>
-        <w:spacing w:after="40"/>
-        <w:ind w:left="360"/>
-      </w:pPr>
-      <w:r>
-        <w:t>1. Converts input 2D list into SymPy Matrix object for exact fraction arithmetic.</w:t>
-      </w:r>
-    </w:p>
-    <w:p>
-      <w:pPr>
-        <w:spacing w:after="40"/>
-        <w:ind w:left="360"/>
-      </w:pPr>
-      <w:r>
-        <w:t>2. Uses mat.rref() to compute Reduced Row Echelon Form and identify pivot column indices.</w:t>
-      </w:r>
-    </w:p>
-    <w:p>
-      <w:pPr>
-        <w:spacing w:after="40"/>
-        <w:ind w:left="360"/>
-      </w:pPr>
-      <w:r>
-        <w:t>3. Iterates row-by-row to perform elementary row operations: Row_i = Row_i / pivot_val.</w:t>
-      </w:r>
-    </w:p>
-    <w:p>
-      <w:pPr>
-        <w:spacing w:after="40"/>
-        <w:ind w:left="360"/>
-      </w:pPr>
-      <w:r>
-        <w:t>4. Eliminates column entries above and below pivots: Row_j = Row_j - (factor * Row_i).</w:t>
-      </w:r>
-    </w:p>
-    <w:p>
-      <w:pPr>
-        <w:spacing w:after="40"/>
-        <w:ind w:left="360"/>
-      </w:pPr>
-      <w:r>
-        <w:t>5. Captures every intermediate matrix state as LaTeX string for step-by-step UI rendering.</w:t>
-      </w:r>
-    </w:p>
-    <w:p>
-      <w:pPr>
-        <w:spacing w:after="40"/>
-        <w:ind w:left="360"/>
-      </w:pPr>
-      <w:r>
-        <w:t>6. Classifies solution type: Unique Solution (rank = n), Infinite Solutions (free variables), or Inconsistent No Solution (0 = c where c != 0).</w:t>
-      </w:r>
-    </w:p>
+    <w:tbl>
+      <w:tblPr>
+        <w:tblW w:type="auto" w:w="0"/>
+        <w:jc w:val="center"/>
+        <w:tblLook w:firstColumn="1" w:firstRow="1" w:lastColumn="0" w:lastRow="0" w:noHBand="0" w:noVBand="1" w:val="04A0"/>
+      </w:tblPr>
+      <w:tblGrid>
+        <w:gridCol w:w="9360"/>
+      </w:tblGrid>
+      <w:tr>
+        <w:tc>
+          <w:tcPr>
+            <w:tcW w:type="dxa" w:w="9360"/>
+            <w:shd w:fill="F8FAFC"/>
+            <w:tcMar>
+              <w:top w:w="120" w:type="dxa"/>
+              <w:bottom w:w="120" w:type="dxa"/>
+              <w:left w:w="180" w:type="dxa"/>
+              <w:right w:w="180" w:type="dxa"/>
+            </w:tcMar>
+          </w:tcPr>
+          <w:p>
+            <w:pPr>
+              <w:spacing w:after="0"/>
+            </w:pPr>
+            <w:r>
+              <w:rPr>
+                <w:rFonts w:ascii="Consolas" w:hAnsi="Consolas"/>
+                <w:color w:val="1E3A8A"/>
+                <w:sz w:val="19"/>
+              </w:rPr>
+              <w:t>def clean_val_2dp(x):</w:t>
+              <w:br/>
+              <w:t xml:space="preserve">    try:</w:t>
+              <w:br/>
+              <w:t xml:space="preserve">        val = sp.sympify(x)</w:t>
+              <w:br/>
+              <w:t xml:space="preserve">        if isinstance(val, (sp.Float, float)):</w:t>
+              <w:br/>
+              <w:t xml:space="preserve">            fval = float(val)</w:t>
+              <w:br/>
+              <w:t xml:space="preserve">            if fval.is_integer(): return sp.Integer(int(fval))</w:t>
+              <w:br/>
+              <w:t xml:space="preserve">            return sp.Float(round(fval, 2))</w:t>
+              <w:br/>
+              <w:t xml:space="preserve">        elif isinstance(val, sp.Basic):</w:t>
+              <w:br/>
+              <w:t xml:space="preserve">            # Substitutes internal floats inside SymPy expressions</w:t>
+              <w:br/>
+              <w:t xml:space="preserve">            floats = val.atoms(sp.Float)</w:t>
+              <w:br/>
+              <w:t xml:space="preserve">            replaces = {fl: sp.Integer(int(fl)) if float(fl).is_integer() else sp.Float(round(float(fl), 2)) for fl in floats}</w:t>
+              <w:br/>
+              <w:t xml:space="preserve">            return val.subs(replaces) if replaces else val</w:t>
+              <w:br/>
+              <w:t xml:space="preserve">        return val</w:t>
+              <w:br/>
+              <w:t xml:space="preserve">    except Exception:</w:t>
+              <w:br/>
+              <w:t xml:space="preserve">        return x</w:t>
+            </w:r>
+          </w:p>
+        </w:tc>
+      </w:tr>
+    </w:tbl>
     <w:p>
       <w:pPr>
         <w:spacing w:after="120"/>
@@ -912,7 +883,7 @@
     <w:p>
       <w:pPr>
         <w:pStyle w:val="Heading2"/>
-        <w:spacing w:before="280" w:after="120"/>
+        <w:spacing w:before="320" w:after="120"/>
       </w:pPr>
       <w:r>
         <w:rPr>
@@ -921,7 +892,101 @@
           <w:color w:val="0F172A"/>
           <w:sz w:val="28"/>
         </w:rPr>
-        <w:t>3.2 Field Axioms via GF(2) (Galois Field mod 2)</w:t>
+        <w:t>3.2 Matrix to LaTeX Formatter: matrix_to_latex(mat)</w:t>
+      </w:r>
+    </w:p>
+    <w:p>
+      <w:r>
+        <w:t>Converts a 2D Python list or SymPy Matrix into a standard LaTeX bmatrix string formatted for MathJax rendering. It joins column entries with '&amp;' and row lines with '\\', wrapped inside \begin{bmatrix} and \end{bmatrix}.</w:t>
+      </w:r>
+    </w:p>
+    <w:tbl>
+      <w:tblPr>
+        <w:tblW w:type="auto" w:w="0"/>
+        <w:jc w:val="center"/>
+        <w:tblLook w:firstColumn="1" w:firstRow="1" w:lastColumn="0" w:lastRow="0" w:noHBand="0" w:noVBand="1" w:val="04A0"/>
+      </w:tblPr>
+      <w:tblGrid>
+        <w:gridCol w:w="9360"/>
+      </w:tblGrid>
+      <w:tr>
+        <w:tc>
+          <w:tcPr>
+            <w:tcW w:type="dxa" w:w="9360"/>
+            <w:shd w:fill="F8FAFC"/>
+            <w:tcMar>
+              <w:top w:w="120" w:type="dxa"/>
+              <w:bottom w:w="120" w:type="dxa"/>
+              <w:left w:w="180" w:type="dxa"/>
+              <w:right w:w="180" w:type="dxa"/>
+            </w:tcMar>
+          </w:tcPr>
+          <w:p>
+            <w:pPr>
+              <w:spacing w:after="0"/>
+            </w:pPr>
+            <w:r>
+              <w:rPr>
+                <w:rFonts w:ascii="Consolas" w:hAnsi="Consolas"/>
+                <w:color w:val="1E3A8A"/>
+                <w:sz w:val="19"/>
+              </w:rPr>
+              <w:t>def matrix_to_latex(matrix):</w:t>
+              <w:br/>
+              <w:t xml:space="preserve">    if matrix is None: return r'\text{N/A}'</w:t>
+              <w:br/>
+              <w:t xml:space="preserve">    arr = matrix.tolist() if isinstance(matrix, sp.Matrix) else np.array(matrix).tolist()</w:t>
+              <w:br/>
+              <w:t xml:space="preserve">    rows = [' &amp; '.join([sp.latex(clean_val_2dp(x)) for x in row]) for row in arr]</w:t>
+              <w:br/>
+              <w:t xml:space="preserve">    return r'\begin{bmatrix} ' + r' \\ '.join(rows) + r' \end{bmatrix}'</w:t>
+            </w:r>
+          </w:p>
+        </w:tc>
+      </w:tr>
+    </w:tbl>
+    <w:p>
+      <w:pPr>
+        <w:spacing w:after="120"/>
+      </w:pPr>
+    </w:p>
+    <w:p>
+      <w:pPr>
+        <w:pStyle w:val="Heading1"/>
+        <w:spacing w:before="320" w:after="120"/>
+      </w:pPr>
+      <w:r>
+        <w:rPr>
+          <w:rFonts w:ascii="Calibri" w:hAnsi="Calibri"/>
+          <w:b/>
+          <w:color w:val="7C3AED"/>
+          <w:sz w:val="36"/>
+        </w:rPr>
+        <w:t>4. Deep Dive: The 6 Linear Algebra Concepts &amp; Code Logic</w:t>
+      </w:r>
+    </w:p>
+    <w:p>
+      <w:pPr>
+        <w:pStyle w:val="Heading2"/>
+        <w:spacing w:before="320" w:after="120"/>
+      </w:pPr>
+      <w:r>
+        <w:rPr>
+          <w:rFonts w:ascii="Calibri" w:hAnsi="Calibri"/>
+          <w:b/>
+          <w:color w:val="0F172A"/>
+          <w:sz w:val="28"/>
+        </w:rPr>
+        <w:t>4.1 Gaussian Elimination &amp; System of Linear Equations</w:t>
+      </w:r>
+    </w:p>
+    <w:p>
+      <w:r>
+        <w:t>• Concept: Transforms an augmented matrix [A | b] into Row Echelon Form (REF) and Reduced Row Echelon Form (RREF) using elementary row operations.</w:t>
+        <w:br/>
+        <w:t>• Data Science Application: Solving normal equations (X^T X) beta = X^T y in Multiple Linear Regression, network flow analysis, and circuit currents.</w:t>
+        <w:br/>
+        <w:t>• Function Name: solve_gaussian_elimination(matrix_data)</w:t>
       </w:r>
     </w:p>
     <w:p>
@@ -929,81 +994,106 @@
         <w:rPr>
           <w:b/>
         </w:rPr>
-        <w:t xml:space="preserve">• Mathematical Concept: </w:t>
-      </w:r>
-      <w:r>
-        <w:t>A Field F is an algebraic structure with two binary operations (Addition and Multiplication) satisfying 11 fundamental axioms. GF(2) = {0, 1} operates under modulo 2 arithmetic where 1 + 1 = 0 (mod 2).</w:t>
+        <w:t>Code Implementation Walkthrough:</w:t>
       </w:r>
     </w:p>
-    <w:p>
-      <w:r>
-        <w:rPr>
-          <w:b/>
-        </w:rPr>
-        <w:t xml:space="preserve">• Data Science Application: </w:t>
-      </w:r>
-      <w:r>
-        <w:t>Cryptography (AES encryption, RSA, LFSRs), Error-Correcting Codes (Hamming codes, Reed-Solomon), digital logic XOR gates, and binary neural networks.</w:t>
-      </w:r>
-    </w:p>
-    <w:p>
-      <w:r>
-        <w:rPr>
-          <w:b/>
-        </w:rPr>
-        <w:t xml:space="preserve">• Python Function: </w:t>
-      </w:r>
-      <w:r>
-        <w:rPr>
-          <w:rFonts w:ascii="Consolas" w:hAnsi="Consolas"/>
-        </w:rPr>
-        <w:t>verify_gf2_field(a, b, op)</w:t>
-      </w:r>
-    </w:p>
-    <w:p>
-      <w:r>
-        <w:rPr>
-          <w:b/>
-        </w:rPr>
-        <w:t>Python Implementation &amp; Logic Walkthrough:</w:t>
-      </w:r>
-    </w:p>
-    <w:p>
-      <w:pPr>
-        <w:spacing w:after="40"/>
-        <w:ind w:left="360"/>
-      </w:pPr>
-      <w:r>
-        <w:t>1. Constructs Addition Cayley Table (+ mod 2 / XOR) and Multiplication Cayley Table (. mod 2 / AND).</w:t>
-      </w:r>
-    </w:p>
-    <w:p>
-      <w:pPr>
-        <w:spacing w:after="40"/>
-        <w:ind w:left="360"/>
-      </w:pPr>
-      <w:r>
-        <w:t>2. Systematically verifies all 11 Field Axioms: Closure, Associativity, Commutativity, Identity (0 for +, 1 for .), Inverses (-a = a mod 2, 1^-1 = 1), and Distributivity.</w:t>
-      </w:r>
-    </w:p>
-    <w:p>
-      <w:pPr>
-        <w:spacing w:after="40"/>
-        <w:ind w:left="360"/>
-      </w:pPr>
-      <w:r>
-        <w:t>3. Demonstrates that 1 + 1 = 0 mod 2, proving every element is its own additive inverse.</w:t>
-      </w:r>
-    </w:p>
-    <w:p>
-      <w:pPr>
-        <w:spacing w:after="40"/>
-        <w:ind w:left="360"/>
-      </w:pPr>
-      <w:r>
-        <w:t>4. Evaluates custom binary tuple input operations (a + b mod 2, a . b mod 2) with step-by-step logical verification.</w:t>
-      </w:r>
-    </w:p>
+    <w:tbl>
+      <w:tblPr>
+        <w:tblW w:type="auto" w:w="0"/>
+        <w:jc w:val="center"/>
+        <w:tblLook w:firstColumn="1" w:firstRow="1" w:lastColumn="0" w:lastRow="0" w:noHBand="0" w:noVBand="1" w:val="04A0"/>
+      </w:tblPr>
+      <w:tblGrid>
+        <w:gridCol w:w="9360"/>
+      </w:tblGrid>
+      <w:tr>
+        <w:tc>
+          <w:tcPr>
+            <w:tcW w:type="dxa" w:w="9360"/>
+            <w:shd w:fill="F8FAFC"/>
+            <w:tcMar>
+              <w:top w:w="120" w:type="dxa"/>
+              <w:bottom w:w="120" w:type="dxa"/>
+              <w:left w:w="180" w:type="dxa"/>
+              <w:right w:w="180" w:type="dxa"/>
+            </w:tcMar>
+          </w:tcPr>
+          <w:p>
+            <w:pPr>
+              <w:spacing w:after="0"/>
+            </w:pPr>
+            <w:r>
+              <w:rPr>
+                <w:rFonts w:ascii="Consolas" w:hAnsi="Consolas"/>
+                <w:color w:val="1E3A8A"/>
+                <w:sz w:val="19"/>
+              </w:rPr>
+              <w:t>def solve_gaussian_elimination(matrix_data):</w:t>
+              <w:br/>
+              <w:t xml:space="preserve">    mat = sp.Matrix(matrix_data)</w:t>
+              <w:br/>
+              <w:t xml:space="preserve">    rows, cols = mat.shape</w:t>
+              <w:br/>
+              <w:t xml:space="preserve">    num_vars = cols - 1</w:t>
+              <w:br/>
+              <w:t xml:space="preserve">    steps = []</w:t>
+              <w:br/>
+              <w:br/>
+              <w:t xml:space="preserve">    # Iterates column by column to process pivots</w:t>
+              <w:br/>
+              <w:t xml:space="preserve">    for c in range(num_vars):</w:t>
+              <w:br/>
+              <w:t xml:space="preserve">        # 1. Search for non-zero pivot in column c</w:t>
+              <w:br/>
+              <w:t xml:space="preserve">        pivot_row = current_row</w:t>
+              <w:br/>
+              <w:t xml:space="preserve">        while pivot_row &lt; rows and mat[pivot_row, c] == 0: pivot_row += 1</w:t>
+              <w:br/>
+              <w:t xml:space="preserve">        if pivot_row != current_row: mat.row_swap(current_row, pivot_row) # Swap rows</w:t>
+              <w:br/>
+              <w:br/>
+              <w:t xml:space="preserve">        # 2. Scale row so pivot value equals 1</w:t>
+              <w:br/>
+              <w:t xml:space="preserve">        pivot_val = mat[current_row, c]</w:t>
+              <w:br/>
+              <w:t xml:space="preserve">        if pivot_val != 1 and pivot_val != 0:</w:t>
+              <w:br/>
+              <w:t xml:space="preserve">            mat.row_op(current_row, lambda val, j: val / pivot_val)</w:t>
+              <w:br/>
+              <w:br/>
+              <w:t xml:space="preserve">        # 3. Eliminate entries above and below pivot (RREF)</w:t>
+              <w:br/>
+              <w:t xml:space="preserve">        for r in range(rows):</w:t>
+              <w:br/>
+              <w:t xml:space="preserve">            if r != current_row and mat[r, c] != 0:</w:t>
+              <w:br/>
+              <w:t xml:space="preserve">                factor = mat[r, c]</w:t>
+              <w:br/>
+              <w:t xml:space="preserve">                mat.row_op(r, lambda val, j: val - factor * mat[current_row, j])</w:t>
+              <w:br/>
+              <w:br/>
+              <w:t xml:space="preserve">    # 4. Solution Type Classification via Rank Analysis</w:t>
+              <w:br/>
+              <w:t xml:space="preserve">    rank_A = mat[:, :num_vars].rank()</w:t>
+              <w:br/>
+              <w:t xml:space="preserve">    rank_aug = mat.rank()</w:t>
+              <w:br/>
+              <w:t xml:space="preserve">    if rank_A &lt; rank_aug:</w:t>
+              <w:br/>
+              <w:t xml:space="preserve">        solution_type = 'Inconsistent System (No Solution)'</w:t>
+              <w:br/>
+              <w:t xml:space="preserve">    elif rank_A == rank_aug == num_vars:</w:t>
+              <w:br/>
+              <w:t xml:space="preserve">        solution_type = 'Unique Solution'</w:t>
+              <w:br/>
+              <w:t xml:space="preserve">    else:</w:t>
+              <w:br/>
+              <w:t xml:space="preserve">        solution_type = 'Infinitely Many Solutions (Parametric)'</w:t>
+            </w:r>
+          </w:p>
+        </w:tc>
+      </w:tr>
+    </w:tbl>
     <w:p>
       <w:pPr>
         <w:spacing w:after="120"/>
@@ -1012,7 +1102,7 @@
     <w:p>
       <w:pPr>
         <w:pStyle w:val="Heading2"/>
-        <w:spacing w:before="280" w:after="120"/>
+        <w:spacing w:before="320" w:after="120"/>
       </w:pPr>
       <w:r>
         <w:rPr>
@@ -1021,7 +1111,16 @@
           <w:color w:val="0F172A"/>
           <w:sz w:val="28"/>
         </w:rPr>
-        <w:t>3.3 3D Vector Operations (Dot Product, Cross Product &amp; Projections)</w:t>
+        <w:t>4.2 Field Axioms via GF(2) (Galois Field mod 2)</w:t>
+      </w:r>
+    </w:p>
+    <w:p>
+      <w:r>
+        <w:t>• Concept: Verifies all 11 Field Axioms on finite set {0, 1} under modulo 2 arithmetic where 1 + 1 = 0 mod 2.</w:t>
+        <w:br/>
+        <w:t>• Data Science &amp; CS Application: Cryptography (AES encryption), Error-Correcting Codes (Hamming &amp; Reed-Solomon), XOR logic gates, and binary neural networks.</w:t>
+        <w:br/>
+        <w:t>• Function Name: analyze_galois_field(modulus=2)</w:t>
       </w:r>
     </w:p>
     <w:p>
@@ -1029,99 +1128,71 @@
         <w:rPr>
           <w:b/>
         </w:rPr>
-        <w:t xml:space="preserve">• Mathematical Concept: </w:t>
-      </w:r>
-      <w:r>
-        <w:t>Computes geometric and algebraic properties of vectors in R^3: Dot Product (v1 . v2), Magnitude (||v||), Angle theta, Orthogonality check, Cross Product (v1 x v2), and Vector Projection proj_v2(v1).</w:t>
+        <w:t>Code Implementation Walkthrough:</w:t>
       </w:r>
     </w:p>
-    <w:p>
-      <w:r>
-        <w:rPr>
-          <w:b/>
-        </w:rPr>
-        <w:t xml:space="preserve">• Data Science Application: </w:t>
-      </w:r>
-      <w:r>
-        <w:t>Cosine Similarity in NLP and Recommendation Engines, Attention mechanisms in Transformer Neural Networks, Computer Vision 3D rendering, and Robotics kinematics.</w:t>
-      </w:r>
-    </w:p>
-    <w:p>
-      <w:r>
-        <w:rPr>
-          <w:b/>
-        </w:rPr>
-        <w:t xml:space="preserve">• Python Function: </w:t>
-      </w:r>
-      <w:r>
-        <w:rPr>
-          <w:rFonts w:ascii="Consolas" w:hAnsi="Consolas"/>
-        </w:rPr>
-        <w:t>solve_vector_operations(v1, v2)</w:t>
-      </w:r>
-    </w:p>
-    <w:p>
-      <w:r>
-        <w:rPr>
-          <w:b/>
-        </w:rPr>
-        <w:t>Python Implementation &amp; Logic Walkthrough:</w:t>
-      </w:r>
-    </w:p>
-    <w:p>
-      <w:pPr>
-        <w:spacing w:after="40"/>
-        <w:ind w:left="360"/>
-      </w:pPr>
-      <w:r>
-        <w:t>1. Dot Product: Computes sum(v1[i] * v2[i]) for i in {0, 1, 2}.</w:t>
-      </w:r>
-    </w:p>
-    <w:p>
-      <w:pPr>
-        <w:spacing w:after="40"/>
-        <w:ind w:left="360"/>
-      </w:pPr>
-      <w:r>
-        <w:t>2. Angle Computation: Computes cos(theta) = (v1 . v2) / (||v1|| * ||v2||), then theta = arccos(cos(theta)).</w:t>
-      </w:r>
-    </w:p>
-    <w:p>
-      <w:pPr>
-        <w:spacing w:after="40"/>
-        <w:ind w:left="360"/>
-      </w:pPr>
-      <w:r>
-        <w:t>3. Orthogonality Test: If v1 . v2 == 0, vectors are strictly orthogonal (perpendicular).</w:t>
-      </w:r>
-    </w:p>
-    <w:p>
-      <w:pPr>
-        <w:spacing w:after="40"/>
-        <w:ind w:left="360"/>
-      </w:pPr>
-      <w:r>
-        <w:t>4. Cross Product: Computes determinant of 3x3 i, j, k matrix: (y1*z2 - z1*y2, z1*x2 - x1*z2, x1*y2 - y1*x2) producing normal vector.</w:t>
-      </w:r>
-    </w:p>
-    <w:p>
-      <w:pPr>
-        <w:spacing w:after="40"/>
-        <w:ind w:left="360"/>
-      </w:pPr>
-      <w:r>
-        <w:t>5. Vector Projection: Computes proj_v2(v1) = ((v1 . v2) / ||v2||^2) * v2.</w:t>
-      </w:r>
-    </w:p>
-    <w:p>
-      <w:pPr>
-        <w:spacing w:after="40"/>
-        <w:ind w:left="360"/>
-      </w:pPr>
-      <w:r>
-        <w:t>6. Renders interactive 3D Orbit Canvas using 2D HTML5 canvas perspective transformation matrices.</w:t>
-      </w:r>
-    </w:p>
+    <w:tbl>
+      <w:tblPr>
+        <w:tblW w:type="auto" w:w="0"/>
+        <w:jc w:val="center"/>
+        <w:tblLook w:firstColumn="1" w:firstRow="1" w:lastColumn="0" w:lastRow="0" w:noHBand="0" w:noVBand="1" w:val="04A0"/>
+      </w:tblPr>
+      <w:tblGrid>
+        <w:gridCol w:w="9360"/>
+      </w:tblGrid>
+      <w:tr>
+        <w:tc>
+          <w:tcPr>
+            <w:tcW w:type="dxa" w:w="9360"/>
+            <w:shd w:fill="F8FAFC"/>
+            <w:tcMar>
+              <w:top w:w="120" w:type="dxa"/>
+              <w:bottom w:w="120" w:type="dxa"/>
+              <w:left w:w="180" w:type="dxa"/>
+              <w:right w:w="180" w:type="dxa"/>
+            </w:tcMar>
+          </w:tcPr>
+          <w:p>
+            <w:pPr>
+              <w:spacing w:after="0"/>
+            </w:pPr>
+            <w:r>
+              <w:rPr>
+                <w:rFonts w:ascii="Consolas" w:hAnsi="Consolas"/>
+                <w:color w:val="1E3A8A"/>
+                <w:sz w:val="19"/>
+              </w:rPr>
+              <w:t>def analyze_galois_field(modulus=2):</w:t>
+              <w:br/>
+              <w:t xml:space="preserve">    elements = [0, 1]</w:t>
+              <w:br/>
+              <w:t xml:space="preserve">    # Addition Table (+ mod 2 / XOR) and Multiplication Table (. mod 2 / AND)</w:t>
+              <w:br/>
+              <w:t xml:space="preserve">    add_table = [[(a + b) % 2 for b in elements] for a in elements]</w:t>
+              <w:br/>
+              <w:t xml:space="preserve">    mul_table = [[(a * b) % 2 for b in elements] for a in elements]</w:t>
+              <w:br/>
+              <w:br/>
+              <w:t xml:space="preserve">    # Additive Inverses: -a = (2 - a) % 2. Notice -1 = 1 mod 2 (since 1 + 1 = 0 mod 2)</w:t>
+              <w:br/>
+              <w:t xml:space="preserve">    add_inverses = {a: (2 - a) % 2 for a in elements}</w:t>
+              <w:br/>
+              <w:br/>
+              <w:t xml:space="preserve">    # Multiplicative Inverses: 1^-1 = 1 mod 2</w:t>
+              <w:br/>
+              <w:t xml:space="preserve">    mul_inverses = {1: 1, 0: None}</w:t>
+              <w:br/>
+              <w:br/>
+              <w:t xml:space="preserve">    # Systematic 11 Field Axiom Verification (Closure, Associativity, Identity, Inverses, Distributivity)</w:t>
+              <w:br/>
+              <w:t xml:space="preserve">    add_closed = all((a + b) % 2 in elements for a in elements for b in elements)</w:t>
+              <w:br/>
+              <w:t xml:space="preserve">    distrib = all((a * ((b + c) % 2)) % 2 == ((a * b) + (a * c)) % 2 for a in elements for b in elements for c in elements)</w:t>
+            </w:r>
+          </w:p>
+        </w:tc>
+      </w:tr>
+    </w:tbl>
     <w:p>
       <w:pPr>
         <w:spacing w:after="120"/>
@@ -1130,7 +1201,7 @@
     <w:p>
       <w:pPr>
         <w:pStyle w:val="Heading2"/>
-        <w:spacing w:before="280" w:after="120"/>
+        <w:spacing w:before="320" w:after="120"/>
       </w:pPr>
       <w:r>
         <w:rPr>
@@ -1139,7 +1210,16 @@
           <w:color w:val="0F172A"/>
           <w:sz w:val="28"/>
         </w:rPr>
-        <w:t>3.4 Gram–Schmidt Process &amp; Orthonormal Basis Construction</w:t>
+        <w:t>4.3 3D Vector Operations &amp; Canvas Visualizer</w:t>
+      </w:r>
+    </w:p>
+    <w:p>
+      <w:r>
+        <w:t>• Concept: Computes magnitude ||v||, Dot product (v1 . v2), Angle theta, Orthogonality, Cross product (v1 x v2), and Projection proj_v2(v1).</w:t>
+        <w:br/>
+        <w:t>• Data Science Application: Cosine Similarity in NLP, Attention Mechanisms in Transformers (QK^T / sqrt(d)), and 3D Computer Vision.</w:t>
+        <w:br/>
+        <w:t>• Function Name: compute_vector_operations(v1_list, v2_list)</w:t>
       </w:r>
     </w:p>
     <w:p>
@@ -1147,90 +1227,71 @@
         <w:rPr>
           <w:b/>
         </w:rPr>
-        <w:t xml:space="preserve">• Mathematical Concept: </w:t>
-      </w:r>
-      <w:r>
-        <w:t>Takes a set of linearly independent vectors {v1, v2, ..., vk} and constructs an orthogonal basis {u1, u2, ..., uk} and an orthonormal basis {e1, e2, ..., ek}.</w:t>
+        <w:t>Code Implementation Walkthrough:</w:t>
       </w:r>
     </w:p>
-    <w:p>
-      <w:r>
-        <w:rPr>
-          <w:b/>
-        </w:rPr>
-        <w:t xml:space="preserve">• Data Science Application: </w:t>
-      </w:r>
-      <w:r>
-        <w:t>QR Decomposition in Linear Least Squares regression, Dimensionality Reduction, Principal Component Analysis (PCA) pre-processing, and Signal Processing (orthogonal basis functions).</w:t>
-      </w:r>
-    </w:p>
-    <w:p>
-      <w:r>
-        <w:rPr>
-          <w:b/>
-        </w:rPr>
-        <w:t xml:space="preserve">• Python Function: </w:t>
-      </w:r>
-      <w:r>
-        <w:rPr>
-          <w:rFonts w:ascii="Consolas" w:hAnsi="Consolas"/>
-        </w:rPr>
-        <w:t>solve_gram_schmidt(vectors)</w:t>
-      </w:r>
-    </w:p>
-    <w:p>
-      <w:r>
-        <w:rPr>
-          <w:b/>
-        </w:rPr>
-        <w:t>Python Implementation &amp; Logic Walkthrough:</w:t>
-      </w:r>
-    </w:p>
-    <w:p>
-      <w:pPr>
-        <w:spacing w:after="40"/>
-        <w:ind w:left="360"/>
-      </w:pPr>
-      <w:r>
-        <w:t>1. Sets initial orthogonal vector u1 = v1.</w:t>
-      </w:r>
-    </w:p>
-    <w:p>
-      <w:pPr>
-        <w:spacing w:after="40"/>
-        <w:ind w:left="360"/>
-      </w:pPr>
-      <w:r>
-        <w:t>2. For step k from 2 to n: Computes uk = vk - sum(proj_uj(vk)) for all preceding j &lt; k.</w:t>
-      </w:r>
-    </w:p>
-    <w:p>
-      <w:pPr>
-        <w:spacing w:after="40"/>
-        <w:ind w:left="360"/>
-      </w:pPr>
-      <w:r>
-        <w:t>3. Normalizes each orthogonal vector: ek = uk / ||uk|| to form orthonormal basis.</w:t>
-      </w:r>
-    </w:p>
-    <w:p>
-      <w:pPr>
-        <w:spacing w:after="40"/>
-        <w:ind w:left="360"/>
-      </w:pPr>
-      <w:r>
-        <w:t>4. Computes Gram Matrix / Inner Product Matrix (ui . uj) to explicitly demonstrate off-diagonal entries are 0 (proving orthogonality).</w:t>
-      </w:r>
-    </w:p>
-    <w:p>
-      <w:pPr>
-        <w:spacing w:after="40"/>
-        <w:ind w:left="360"/>
-      </w:pPr>
-      <w:r>
-        <w:t>5. Generates step-by-step LaTeX derivation for each vector projection subtraction.</w:t>
-      </w:r>
-    </w:p>
+    <w:tbl>
+      <w:tblPr>
+        <w:tblW w:type="auto" w:w="0"/>
+        <w:jc w:val="center"/>
+        <w:tblLook w:firstColumn="1" w:firstRow="1" w:lastColumn="0" w:lastRow="0" w:noHBand="0" w:noVBand="1" w:val="04A0"/>
+      </w:tblPr>
+      <w:tblGrid>
+        <w:gridCol w:w="9360"/>
+      </w:tblGrid>
+      <w:tr>
+        <w:tc>
+          <w:tcPr>
+            <w:tcW w:type="dxa" w:w="9360"/>
+            <w:shd w:fill="F8FAFC"/>
+            <w:tcMar>
+              <w:top w:w="120" w:type="dxa"/>
+              <w:bottom w:w="120" w:type="dxa"/>
+              <w:left w:w="180" w:type="dxa"/>
+              <w:right w:w="180" w:type="dxa"/>
+            </w:tcMar>
+          </w:tcPr>
+          <w:p>
+            <w:pPr>
+              <w:spacing w:after="0"/>
+            </w:pPr>
+            <w:r>
+              <w:rPr>
+                <w:rFonts w:ascii="Consolas" w:hAnsi="Consolas"/>
+                <w:color w:val="1E3A8A"/>
+                <w:sz w:val="19"/>
+              </w:rPr>
+              <w:t>def compute_vector_operations(v1_list, v2_list):</w:t>
+              <w:br/>
+              <w:t xml:space="preserve">    v1, v2 = np.array(v1_list), np.array(v2_list)</w:t>
+              <w:br/>
+              <w:t xml:space="preserve">    mag1, mag2 = np.linalg.norm(v1), np.linalg.norm(v2)</w:t>
+              <w:br/>
+              <w:br/>
+              <w:t xml:space="preserve">    # Dot Product &amp; Angle Computation</w:t>
+              <w:br/>
+              <w:t xml:space="preserve">    dot_prod = np.dot(v1, v2)</w:t>
+              <w:br/>
+              <w:t xml:space="preserve">    cos_theta = np.clip(dot_prod / (mag1 * mag2), -1.0, 1.0)</w:t>
+              <w:br/>
+              <w:t xml:space="preserve">    angle_deg = np.degrees(np.arccos(cos_theta))</w:t>
+              <w:br/>
+              <w:br/>
+              <w:t xml:space="preserve">    # Cross Product (3x3 determinant expansion for normal vector)</w:t>
+              <w:br/>
+              <w:t xml:space="preserve">    cross_prod = np.cross(v1, v2)</w:t>
+              <w:br/>
+              <w:br/>
+              <w:t xml:space="preserve">    # Vector Projection proj_v2(v1) = ((v1 . v2) / ||v2||^2) * v2</w:t>
+              <w:br/>
+              <w:t xml:space="preserve">    proj_vector = (dot_prod / (mag2 ** 2)) * v2 if mag2 &gt; 0 else np.zeros(3)</w:t>
+              <w:br/>
+              <w:t xml:space="preserve">    is_orthogonal = np.isclose(dot_prod, 0.0)</w:t>
+            </w:r>
+          </w:p>
+        </w:tc>
+      </w:tr>
+    </w:tbl>
     <w:p>
       <w:pPr>
         <w:spacing w:after="120"/>
@@ -1239,7 +1300,7 @@
     <w:p>
       <w:pPr>
         <w:pStyle w:val="Heading2"/>
-        <w:spacing w:before="280" w:after="120"/>
+        <w:spacing w:before="320" w:after="120"/>
       </w:pPr>
       <w:r>
         <w:rPr>
@@ -1248,7 +1309,16 @@
           <w:color w:val="0F172A"/>
           <w:sz w:val="28"/>
         </w:rPr>
-        <w:t>3.5 Cofactor Expansion for Matrix Determinants</w:t>
+        <w:t>4.4 Gram–Schmidt Process &amp; Orthonormal Basis Construction</w:t>
+      </w:r>
+    </w:p>
+    <w:p>
+      <w:r>
+        <w:t>• Concept: Transforms linearly independent vectors {v1, ..., vk} into an orthogonal basis {u1, ..., uk} and orthonormal basis {e1, ..., ek}.</w:t>
+        <w:br/>
+        <w:t>• Data Science Application: QR Decomposition (A = QR), numerical stability in least squares regression, and PCA pre-processing.</w:t>
+        <w:br/>
+        <w:t>• Function Name: solve_gram_schmidt(vectors_data)</w:t>
       </w:r>
     </w:p>
     <w:p>
@@ -1256,99 +1326,76 @@
         <w:rPr>
           <w:b/>
         </w:rPr>
-        <w:t xml:space="preserve">• Mathematical Concept: </w:t>
-      </w:r>
-      <w:r>
-        <w:t>Computes determinant det(A) of an n x n matrix by expanding along any chosen row i or column j using minor matrices Mij and checkerboard signs (-1)^(i+j).</w:t>
+        <w:t>Code Implementation Walkthrough:</w:t>
       </w:r>
     </w:p>
-    <w:p>
-      <w:r>
-        <w:rPr>
-          <w:b/>
-        </w:rPr>
-        <w:t xml:space="preserve">• Data Science Application: </w:t>
-      </w:r>
-      <w:r>
-        <w:t>Matrix invertibility testing (det(A) != 0), volume transformation scaling factors in multivariable calculus, change of variables (Jacobian determinants), and Cramer's Rule.</w:t>
-      </w:r>
-    </w:p>
-    <w:p>
-      <w:r>
-        <w:rPr>
-          <w:b/>
-        </w:rPr>
-        <w:t xml:space="preserve">• Python Function: </w:t>
-      </w:r>
-      <w:r>
-        <w:rPr>
-          <w:rFonts w:ascii="Consolas" w:hAnsi="Consolas"/>
-        </w:rPr>
-        <w:t>solve_cofactor_expansion(matrix_data, expand_by, idx)</w:t>
-      </w:r>
-    </w:p>
-    <w:p>
-      <w:r>
-        <w:rPr>
-          <w:b/>
-        </w:rPr>
-        <w:t>Python Implementation &amp; Logic Walkthrough:</w:t>
-      </w:r>
-    </w:p>
-    <w:p>
-      <w:pPr>
-        <w:spacing w:after="40"/>
-        <w:ind w:left="360"/>
-      </w:pPr>
-      <w:r>
-        <w:t>1. Extracts specified row or column index (0-indexed).</w:t>
-      </w:r>
-    </w:p>
-    <w:p>
-      <w:pPr>
-        <w:spacing w:after="40"/>
-        <w:ind w:left="360"/>
-      </w:pPr>
-      <w:r>
-        <w:t>2. For each entry a_ij in row/col: Constructs (n-1)x(n-1) minor submatrix Mij by removing row i and column j.</w:t>
-      </w:r>
-    </w:p>
-    <w:p>
-      <w:pPr>
-        <w:spacing w:after="40"/>
-        <w:ind w:left="360"/>
-      </w:pPr>
-      <w:r>
-        <w:t>3. Computes minor determinant det(Mij) and sign factor (-1)^(i+j).</w:t>
-      </w:r>
-    </w:p>
-    <w:p>
-      <w:pPr>
-        <w:spacing w:after="40"/>
-        <w:ind w:left="360"/>
-      </w:pPr>
-      <w:r>
-        <w:t>4. Calculates cofactor C_ij = (-1)^(i+j) * det(Mij) and term contribution a_ij * C_ij.</w:t>
-      </w:r>
-    </w:p>
-    <w:p>
-      <w:pPr>
-        <w:spacing w:after="40"/>
-        <w:ind w:left="360"/>
-      </w:pPr>
-      <w:r>
-        <w:t>5. Sums all term contributions to obtain total determinant det(A) = sum(a_ij * C_ij).</w:t>
-      </w:r>
-    </w:p>
-    <w:p>
-      <w:pPr>
-        <w:spacing w:after="40"/>
-        <w:ind w:left="360"/>
-      </w:pPr>
-      <w:r>
-        <w:t>6. Generates full Checkerboard Sign Matrix (-1)^(i+j) for visual reference.</w:t>
-      </w:r>
-    </w:p>
+    <w:tbl>
+      <w:tblPr>
+        <w:tblW w:type="auto" w:w="0"/>
+        <w:jc w:val="center"/>
+        <w:tblLook w:firstColumn="1" w:firstRow="1" w:lastColumn="0" w:lastRow="0" w:noHBand="0" w:noVBand="1" w:val="04A0"/>
+      </w:tblPr>
+      <w:tblGrid>
+        <w:gridCol w:w="9360"/>
+      </w:tblGrid>
+      <w:tr>
+        <w:tc>
+          <w:tcPr>
+            <w:tcW w:type="dxa" w:w="9360"/>
+            <w:shd w:fill="F8FAFC"/>
+            <w:tcMar>
+              <w:top w:w="120" w:type="dxa"/>
+              <w:bottom w:w="120" w:type="dxa"/>
+              <w:left w:w="180" w:type="dxa"/>
+              <w:right w:w="180" w:type="dxa"/>
+            </w:tcMar>
+          </w:tcPr>
+          <w:p>
+            <w:pPr>
+              <w:spacing w:after="0"/>
+            </w:pPr>
+            <w:r>
+              <w:rPr>
+                <w:rFonts w:ascii="Consolas" w:hAnsi="Consolas"/>
+                <w:color w:val="1E3A8A"/>
+                <w:sz w:val="19"/>
+              </w:rPr>
+              <w:t>def solve_gram_schmidt(vectors_data):</w:t>
+              <w:br/>
+              <w:t xml:space="preserve">    orig_vectors = [sp.Matrix(v) for v in vectors_data]</w:t>
+              <w:br/>
+              <w:t xml:space="preserve">    u_vectors, e_vectors = [], []</w:t>
+              <w:br/>
+              <w:br/>
+              <w:t xml:space="preserve">    for i in range(len(orig_vectors)):</w:t>
+              <w:br/>
+              <w:t xml:space="preserve">        v_i = orig_vectors[i]</w:t>
+              <w:br/>
+              <w:t xml:space="preserve">        u_i = v_i.copy()</w:t>
+              <w:br/>
+              <w:t xml:space="preserve">        # Subtract vector projections onto all preceding orthogonal vectors u_j</w:t>
+              <w:br/>
+              <w:t xml:space="preserve">        for j in range(i):            u_j = u_vectors[j]</w:t>
+              <w:br/>
+              <w:t xml:space="preserve">            proj_coeff = v_i.dot(u_j) / u_j.dot(u_j)</w:t>
+              <w:br/>
+              <w:t xml:space="preserve">            u_i = u_i - proj_coeff * u_j</w:t>
+              <w:br/>
+              <w:t xml:space="preserve">        u_vectors.append(u_i)</w:t>
+              <w:br/>
+              <w:t xml:space="preserve">        # Normalization to unit length e_i = u_i / ||u_i||</w:t>
+              <w:br/>
+              <w:t xml:space="preserve">        u_norm = sp.sqrt(u_i.dot(u_i))</w:t>
+              <w:br/>
+              <w:t xml:space="preserve">        e_vectors.append(u_i / u_norm if u_norm != 0 else u_i)</w:t>
+              <w:br/>
+              <w:br/>
+              <w:t xml:space="preserve">    # Computes Inner Product Matrix (ei . ej) to demonstrate off-diagonal entries equal 0</w:t>
+            </w:r>
+          </w:p>
+        </w:tc>
+      </w:tr>
+    </w:tbl>
     <w:p>
       <w:pPr>
         <w:spacing w:after="120"/>
@@ -1357,7 +1404,7 @@
     <w:p>
       <w:pPr>
         <w:pStyle w:val="Heading2"/>
-        <w:spacing w:before="280" w:after="120"/>
+        <w:spacing w:before="320" w:after="120"/>
       </w:pPr>
       <w:r>
         <w:rPr>
@@ -1366,7 +1413,16 @@
           <w:color w:val="0F172A"/>
           <w:sz w:val="28"/>
         </w:rPr>
-        <w:t>3.6 Matrix Diagonalization &amp; Eigenspaces (A = P D P^-1)</w:t>
+        <w:t>4.5 Cofactor Expansion for Matrix Determinants</w:t>
+      </w:r>
+    </w:p>
+    <w:p>
+      <w:r>
+        <w:t>• Concept: Calculates det(A) along any chosen row i or column j using minor submatrices Mij and cofactors C_ij = (-1)^(i+j) * det(Mij).</w:t>
+        <w:br/>
+        <w:t>• Data Science Application: Matrix invertibility testing (det(A) != 0), Jacobian volume transformation scaling factors, and Cramer's Rule.</w:t>
+        <w:br/>
+        <w:t>• Function Name: solve_cofactor_expansion(matrix_data, expand_by, idx)</w:t>
       </w:r>
     </w:p>
     <w:p>
@@ -1374,10 +1430,97 @@
         <w:rPr>
           <w:b/>
         </w:rPr>
-        <w:t xml:space="preserve">• Mathematical Concept: </w:t>
+        <w:t>Code Implementation Walkthrough:</w:t>
       </w:r>
+    </w:p>
+    <w:tbl>
+      <w:tblPr>
+        <w:tblW w:type="auto" w:w="0"/>
+        <w:jc w:val="center"/>
+        <w:tblLook w:firstColumn="1" w:firstRow="1" w:lastColumn="0" w:lastRow="0" w:noHBand="0" w:noVBand="1" w:val="04A0"/>
+      </w:tblPr>
+      <w:tblGrid>
+        <w:gridCol w:w="9360"/>
+      </w:tblGrid>
+      <w:tr>
+        <w:tc>
+          <w:tcPr>
+            <w:tcW w:type="dxa" w:w="9360"/>
+            <w:shd w:fill="F8FAFC"/>
+            <w:tcMar>
+              <w:top w:w="120" w:type="dxa"/>
+              <w:bottom w:w="120" w:type="dxa"/>
+              <w:left w:w="180" w:type="dxa"/>
+              <w:right w:w="180" w:type="dxa"/>
+            </w:tcMar>
+          </w:tcPr>
+          <w:p>
+            <w:pPr>
+              <w:spacing w:after="0"/>
+            </w:pPr>
+            <w:r>
+              <w:rPr>
+                <w:rFonts w:ascii="Consolas" w:hAnsi="Consolas"/>
+                <w:color w:val="1E3A8A"/>
+                <w:sz w:val="19"/>
+              </w:rPr>
+              <w:t>def solve_cofactor_expansion(matrix_data, expand_by='row', idx=0):</w:t>
+              <w:br/>
+              <w:t xml:space="preserve">    mat = sp.Matrix(matrix_data)</w:t>
+              <w:br/>
+              <w:t xml:space="preserve">    n, m = mat.shape</w:t>
+              <w:br/>
+              <w:t xml:space="preserve">    terms, total_det = [], 0</w:t>
+              <w:br/>
+              <w:t xml:space="preserve">    r = idx</w:t>
+              <w:br/>
+              <w:t xml:space="preserve">    for c in range(n):</w:t>
+              <w:br/>
+              <w:t xml:space="preserve">        val = mat[r, c]</w:t>
+              <w:br/>
+              <w:t xml:space="preserve">        sub_mat = mat.minor_submatrix(r, c) # Deletes row r and column c</w:t>
+              <w:br/>
+              <w:t xml:space="preserve">        minor_det = sub_mat.det()</w:t>
+              <w:br/>
+              <w:t xml:space="preserve">        sign = (-1) ** (r + c) # Checkerboard sign factor</w:t>
+              <w:br/>
+              <w:t xml:space="preserve">        cofactor = sign * minor_det</w:t>
+              <w:br/>
+              <w:t xml:space="preserve">        term_val = val * cofactor</w:t>
+              <w:br/>
+              <w:t xml:space="preserve">        total_det += term_val # Sums term contributions det(A) = sum(a_ij * C_ij)</w:t>
+            </w:r>
+          </w:p>
+        </w:tc>
+      </w:tr>
+    </w:tbl>
+    <w:p>
+      <w:pPr>
+        <w:spacing w:after="120"/>
+      </w:pPr>
+    </w:p>
+    <w:p>
+      <w:pPr>
+        <w:pStyle w:val="Heading2"/>
+        <w:spacing w:before="320" w:after="120"/>
+      </w:pPr>
       <w:r>
-        <w:t>Decomposes a square matrix A into A = P D P^-1, where D is a diagonal matrix of eigenvalues and P is a matrix whose columns are corresponding linearly independent eigenvectors.</w:t>
+        <w:rPr>
+          <w:rFonts w:ascii="Calibri" w:hAnsi="Calibri"/>
+          <w:b/>
+          <w:color w:val="0F172A"/>
+          <w:sz w:val="28"/>
+        </w:rPr>
+        <w:t>4.6 Matrix Diagonalization &amp; Eigenspaces (A = P D P^-1)</w:t>
+      </w:r>
+    </w:p>
+    <w:p>
+      <w:r>
+        <w:t>• Concept: Decomposes square matrix A into A = P D P^-1, where D is diagonal matrix of eigenvalues and P contains eigenvectors.</w:t>
+        <w:br/>
+        <w:t>• Data Science Application: Principal Component Analysis (PCA) covariance matrix decomposition, Google's PageRank algorithm, and Markov Chains.</w:t>
+        <w:br/>
+        <w:t>• Function Name: solve_diagonalization(matrix_data)</w:t>
       </w:r>
     </w:p>
     <w:p>
@@ -1385,79 +1528,70 @@
         <w:rPr>
           <w:b/>
         </w:rPr>
-        <w:t xml:space="preserve">• Data Science Application: </w:t>
-      </w:r>
-      <w:r>
-        <w:t>Principal Component Analysis (PCA) covariance matrix decomposition, Google's PageRank algorithm, Markov Chain steady-state analysis, Graph Spectral Clustering, and Quantum Mechanics wavefunctions.</w:t>
+        <w:t>Code Implementation Walkthrough:</w:t>
       </w:r>
     </w:p>
-    <w:p>
-      <w:r>
-        <w:rPr>
-          <w:b/>
-        </w:rPr>
-        <w:t xml:space="preserve">• Python Function: </w:t>
-      </w:r>
-      <w:r>
-        <w:rPr>
-          <w:rFonts w:ascii="Consolas" w:hAnsi="Consolas"/>
-        </w:rPr>
-        <w:t>solve_diagonalization(matrix_data)</w:t>
-      </w:r>
-    </w:p>
-    <w:p>
-      <w:r>
-        <w:rPr>
-          <w:b/>
-        </w:rPr>
-        <w:t>Python Implementation &amp; Logic Walkthrough:</w:t>
-      </w:r>
-    </w:p>
-    <w:p>
-      <w:pPr>
-        <w:spacing w:after="40"/>
-        <w:ind w:left="360"/>
-      </w:pPr>
-      <w:r>
-        <w:t>1. Characteristic Polynomial: Solves P(lambda) = det(A - lambda*I) = 0 using SymPy symbolic solver.</w:t>
-      </w:r>
-    </w:p>
-    <w:p>
-      <w:pPr>
-        <w:spacing w:after="40"/>
-        <w:ind w:left="360"/>
-      </w:pPr>
-      <w:r>
-        <w:t>2. Eigenvalues &amp; Multiplicities: Extracts all roots lambda_i, calculates Algebraic Multiplicity AM(lambda_i).</w:t>
-      </w:r>
-    </w:p>
-    <w:p>
-      <w:pPr>
-        <w:spacing w:after="40"/>
-        <w:ind w:left="360"/>
-      </w:pPr>
-      <w:r>
-        <w:t>3. Eigenspace Basis: For each eigenvalue, solves (A - lambda_i*I)x = 0 to find basis eigenvectors and Geometric Multiplicity GM(lambda_i) = nullity(A - lambda_i*I).</w:t>
-      </w:r>
-    </w:p>
-    <w:p>
-      <w:pPr>
-        <w:spacing w:after="40"/>
-        <w:ind w:left="360"/>
-      </w:pPr>
-      <w:r>
-        <w:t>4. Diagonalizability Criterion: Matrix is diagonalizable if and only if GM(lambda_i) == AM(lambda_i) for all eigenvalues.</w:t>
-      </w:r>
-    </w:p>
-    <w:p>
-      <w:pPr>
-        <w:spacing w:after="40"/>
-        <w:ind w:left="360"/>
-      </w:pPr>
-      <w:r>
-        <w:t>5. Matrix Construction: Assembles eigenvector matrix P, diagonal matrix D, computes P^-1, and verifies A = P D P^-1.</w:t>
-      </w:r>
-    </w:p>
+    <w:tbl>
+      <w:tblPr>
+        <w:tblW w:type="auto" w:w="0"/>
+        <w:jc w:val="center"/>
+        <w:tblLook w:firstColumn="1" w:firstRow="1" w:lastColumn="0" w:lastRow="0" w:noHBand="0" w:noVBand="1" w:val="04A0"/>
+      </w:tblPr>
+      <w:tblGrid>
+        <w:gridCol w:w="9360"/>
+      </w:tblGrid>
+      <w:tr>
+        <w:tc>
+          <w:tcPr>
+            <w:tcW w:type="dxa" w:w="9360"/>
+            <w:shd w:fill="F8FAFC"/>
+            <w:tcMar>
+              <w:top w:w="120" w:type="dxa"/>
+              <w:bottom w:w="120" w:type="dxa"/>
+              <w:left w:w="180" w:type="dxa"/>
+              <w:right w:w="180" w:type="dxa"/>
+            </w:tcMar>
+          </w:tcPr>
+          <w:p>
+            <w:pPr>
+              <w:spacing w:after="0"/>
+            </w:pPr>
+            <w:r>
+              <w:rPr>
+                <w:rFonts w:ascii="Consolas" w:hAnsi="Consolas"/>
+                <w:color w:val="1E3A8A"/>
+                <w:sz w:val="19"/>
+              </w:rPr>
+              <w:t>def solve_diagonalization(matrix_data):</w:t>
+              <w:br/>
+              <w:t xml:space="preserve">    mat = sp.Matrix(matrix_data)</w:t>
+              <w:br/>
+              <w:t xml:space="preserve">    lam = sp.Symbol('\lambda')</w:t>
+              <w:br/>
+              <w:t xml:space="preserve">    char_poly = (mat - lam * sp.eye(n)).det() # det(A - lambda*I) = 0</w:t>
+              <w:br/>
+              <w:t xml:space="preserve">    eigen_info = mat.eigenvects()</w:t>
+              <w:br/>
+              <w:t xml:space="preserve">    # Extracts eigenvalues, Algebraic Multiplicity AM(lambda), and Geometric Multiplicity GM(lambda)</w:t>
+              <w:br/>
+              <w:t xml:space="preserve">    total_geom_mult = sum([len(vects) for val, alg_mult, vects in eigen_info])</w:t>
+              <w:br/>
+              <w:t xml:space="preserve">    # Diagonalizability test: Matrix is diagonalizable iff GM(lambda) == AM(lambda) for all eigenvalues</w:t>
+              <w:br/>
+              <w:t xml:space="preserve">    if total_geom_mult == n:</w:t>
+              <w:br/>
+              <w:t xml:space="preserve">        P_mat = sp.Matrix.hstack(*P_cols) # Eigenvector column matrix P</w:t>
+              <w:br/>
+              <w:t xml:space="preserve">        D_mat = sp.diag(*D_diag)          # Eigenvalue diagonal matrix D</w:t>
+              <w:br/>
+              <w:t xml:space="preserve">        P_inv = P_mat.inv()</w:t>
+              <w:br/>
+              <w:t xml:space="preserve">        # Verifies A == P * D * P^-1</w:t>
+            </w:r>
+          </w:p>
+        </w:tc>
+      </w:tr>
+    </w:tbl>
     <w:p>
       <w:pPr>
         <w:spacing w:after="120"/>
@@ -1466,7 +1600,7 @@
     <w:p>
       <w:pPr>
         <w:pStyle w:val="Heading1"/>
-        <w:spacing w:before="280" w:after="120"/>
+        <w:spacing w:before="320" w:after="120"/>
       </w:pPr>
       <w:r>
         <w:rPr>
@@ -1475,7 +1609,7 @@
           <w:color w:val="7C3AED"/>
           <w:sz w:val="36"/>
         </w:rPr>
-        <w:t>4. Viva Voce Oral Exam Defense &amp; Q&amp;A Guide</w:t>
+        <w:t>5. Master Viva Voce Oral Exam Defense Guide</w:t>
       </w:r>
     </w:p>
     <w:p>
@@ -1631,9 +1765,71 @@
       </w:r>
     </w:p>
     <w:p>
+      <w:r>
+        <w:rPr>
+          <w:b/>
+        </w:rPr>
+        <w:t>Summary Statements to Say Out Loud During Viva:</w:t>
+      </w:r>
+    </w:p>
+    <w:p>
+      <w:pPr>
+        <w:spacing w:after="80"/>
+        <w:ind w:left="288"/>
+      </w:pPr>
+      <w:r>
+        <w:t>1. Gaussian Elimination: 'We convert the augmented matrix into RREF using row operations and compare rank(A) with rank([A|b]) to classify unique, infinite, or no solutions.'</w:t>
+      </w:r>
+    </w:p>
+    <w:p>
+      <w:pPr>
+        <w:spacing w:after="80"/>
+        <w:ind w:left="288"/>
+      </w:pPr>
+      <w:r>
+        <w:t>2. GF(2): 'GF(2) is Galois Field mod 2 with elements {0, 1}. Addition is XOR (1+1=0 mod 2) and multiplication is AND. We verified all 11 field axioms.'</w:t>
+      </w:r>
+    </w:p>
+    <w:p>
+      <w:pPr>
+        <w:spacing w:after="80"/>
+        <w:ind w:left="288"/>
+      </w:pPr>
+      <w:r>
+        <w:t>3. 3D Vectors: 'We compute dot product for angles/orthogonality, cross product for normal vectors, and project 3D coordinates onto a 2D HTML5 canvas using 3D rotation matrices.'</w:t>
+      </w:r>
+    </w:p>
+    <w:p>
+      <w:pPr>
+        <w:spacing w:after="80"/>
+        <w:ind w:left="288"/>
+      </w:pPr>
+      <w:r>
+        <w:t>4. Gram-Schmidt: 'Gram-Schmidt converts independent vectors into an orthogonal basis by subtracting vector projections onto previous orthogonal vectors, then normalizes them.'</w:t>
+      </w:r>
+    </w:p>
+    <w:p>
+      <w:pPr>
+        <w:spacing w:after="80"/>
+        <w:ind w:left="288"/>
+      </w:pPr>
+      <w:r>
+        <w:t>5. Cofactor Expansion: 'We expand along any row/col by removing entry row/col to form minor matrices Mij, calculate cofactors (-1)^(i+j)*det(Mij), and sum term contributions.'</w:t>
+      </w:r>
+    </w:p>
+    <w:p>
+      <w:pPr>
+        <w:spacing w:after="80"/>
+        <w:ind w:left="288"/>
+      </w:pPr>
+      <w:r>
+        <w:t>6. Diagonalization: 'We solve det(A - lambda*I) = 0 for eigenvalues, compute eigenspaces, verify GM(lambda) == AM(lambda), and construct P and D such that A = P D P^-1.'</w:t>
+      </w:r>
+    </w:p>
+    <w:p>
       <w:pPr>
         <w:pStyle w:val="Heading1"/>
-        <w:spacing w:before="280" w:after="120"/>
+        <w:spacing w:before="320" w:after="120"/>
       </w:pPr>
       <w:r>
         <w:rPr>
@@ -1642,7 +1838,7 @@
           <w:color w:val="7C3AED"/>
           <w:sz w:val="36"/>
         </w:rPr>
-        <w:t>5. Conclusion &amp; Project Deliverables</w:t>
+        <w:t>6. Conclusion &amp; Project Deliverables</w:t>
       </w:r>
     </w:p>
     <w:p>

</xml_diff>